<commit_message>
Switch the quote template to B5 landscape
Set the page to 257x182mm with w:orient="landscape" and widen the table to
22.1cm so it fills the wider content area instead of leaving the right third
blank.

Pin the column proportions while doing so: setting cell widths alone leaves
tblGrid evenly distributed, and Word can lay the table out from that grid
rather than the cell widths, rendering six equal columns. Write the grid to
match and set a fixed table layout.

Co-Authored-By: Claude Opus 4.8 <noreply@anthropic.com>
Claude-Session: https://claude.ai/code/session_01FmATSSm8rVRDX1JZwo8hRE
</commit_message>
<xml_diff>
--- a/報價單_HTML/範本/報價單範本.docx
+++ b/報價單_HTML/範本/報價單範本.docx
@@ -41,20 +41,22 @@
         <w:tblStyle w:val="TableGrid"/>
         <w:tblW w:type="auto" w:w="0"/>
         <w:jc w:val="center"/>
+        <w:tblLayout w:type="fixed"/>
         <w:tblLook w:firstColumn="1" w:firstRow="1" w:lastColumn="0" w:lastRow="0" w:noHBand="0" w:noVBand="1" w:val="04A0"/>
+        <w:tblLayout w:type="fixed"/>
       </w:tblPr>
       <w:tblGrid>
-        <w:gridCol w:w="1398"/>
-        <w:gridCol w:w="1398"/>
-        <w:gridCol w:w="1398"/>
-        <w:gridCol w:w="1398"/>
-        <w:gridCol w:w="1398"/>
-        <w:gridCol w:w="1398"/>
+        <w:gridCol w:w="2551"/>
+        <w:gridCol w:w="3118"/>
+        <w:gridCol w:w="1587"/>
+        <w:gridCol w:w="1587"/>
+        <w:gridCol w:w="1814"/>
+        <w:gridCol w:w="1871"/>
       </w:tblGrid>
       <w:tr>
         <w:tc>
           <w:tcPr>
-            <w:tcW w:type="dxa" w:w="1474"/>
+            <w:tcW w:type="dxa" w:w="2551"/>
           </w:tcPr>
           <w:p>
             <w:pPr>
@@ -74,7 +76,7 @@
         </w:tc>
         <w:tc>
           <w:tcPr>
-            <w:tcW w:type="dxa" w:w="2041"/>
+            <w:tcW w:type="dxa" w:w="3118"/>
           </w:tcPr>
           <w:p>
             <w:pPr>
@@ -94,7 +96,7 @@
         </w:tc>
         <w:tc>
           <w:tcPr>
-            <w:tcW w:type="dxa" w:w="1020"/>
+            <w:tcW w:type="dxa" w:w="1587"/>
           </w:tcPr>
           <w:p>
             <w:pPr>
@@ -114,7 +116,7 @@
         </w:tc>
         <w:tc>
           <w:tcPr>
-            <w:tcW w:type="dxa" w:w="1020"/>
+            <w:tcW w:type="dxa" w:w="1587"/>
           </w:tcPr>
           <w:p>
             <w:pPr>
@@ -134,7 +136,7 @@
         </w:tc>
         <w:tc>
           <w:tcPr>
-            <w:tcW w:type="dxa" w:w="1304"/>
+            <w:tcW w:type="dxa" w:w="1814"/>
           </w:tcPr>
           <w:p>
             <w:pPr>
@@ -154,7 +156,7 @@
         </w:tc>
         <w:tc>
           <w:tcPr>
-            <w:tcW w:type="dxa" w:w="1304"/>
+            <w:tcW w:type="dxa" w:w="1871"/>
           </w:tcPr>
           <w:p>
             <w:pPr>
@@ -176,7 +178,7 @@
       <w:tr>
         <w:tc>
           <w:tcPr>
-            <w:tcW w:type="dxa" w:w="1474"/>
+            <w:tcW w:type="dxa" w:w="2551"/>
           </w:tcPr>
           <w:p>
             <w:pPr>
@@ -196,7 +198,7 @@
         </w:tc>
         <w:tc>
           <w:tcPr>
-            <w:tcW w:type="dxa" w:w="2041"/>
+            <w:tcW w:type="dxa" w:w="3118"/>
           </w:tcPr>
           <w:p>
             <w:pPr>
@@ -216,7 +218,7 @@
         </w:tc>
         <w:tc>
           <w:tcPr>
-            <w:tcW w:type="dxa" w:w="1020"/>
+            <w:tcW w:type="dxa" w:w="1587"/>
           </w:tcPr>
           <w:p>
             <w:pPr>
@@ -236,7 +238,7 @@
         </w:tc>
         <w:tc>
           <w:tcPr>
-            <w:tcW w:type="dxa" w:w="1020"/>
+            <w:tcW w:type="dxa" w:w="1587"/>
           </w:tcPr>
           <w:p>
             <w:pPr>
@@ -256,7 +258,7 @@
         </w:tc>
         <w:tc>
           <w:tcPr>
-            <w:tcW w:type="dxa" w:w="1304"/>
+            <w:tcW w:type="dxa" w:w="1814"/>
           </w:tcPr>
           <w:p>
             <w:pPr>
@@ -276,7 +278,7 @@
         </w:tc>
         <w:tc>
           <w:tcPr>
-            <w:tcW w:type="dxa" w:w="1304"/>
+            <w:tcW w:type="dxa" w:w="1871"/>
           </w:tcPr>
           <w:p>
             <w:pPr>
@@ -298,7 +300,7 @@
       <w:tr>
         <w:tc>
           <w:tcPr>
-            <w:tcW w:type="dxa" w:w="2041"/>
+            <w:tcW w:type="dxa" w:w="3118"/>
             <w:gridSpan w:val="2"/>
           </w:tcPr>
           <w:p>
@@ -319,7 +321,7 @@
         </w:tc>
         <w:tc>
           <w:tcPr>
-            <w:tcW w:type="dxa" w:w="1020"/>
+            <w:tcW w:type="dxa" w:w="1587"/>
           </w:tcPr>
           <w:p>
             <w:pPr>
@@ -339,7 +341,7 @@
         </w:tc>
         <w:tc>
           <w:tcPr>
-            <w:tcW w:type="dxa" w:w="1020"/>
+            <w:tcW w:type="dxa" w:w="1587"/>
           </w:tcPr>
           <w:p>
             <w:pPr>
@@ -359,7 +361,7 @@
         </w:tc>
         <w:tc>
           <w:tcPr>
-            <w:tcW w:type="dxa" w:w="1304"/>
+            <w:tcW w:type="dxa" w:w="1814"/>
           </w:tcPr>
           <w:p>
             <w:pPr>
@@ -379,7 +381,7 @@
         </w:tc>
         <w:tc>
           <w:tcPr>
-            <w:tcW w:type="dxa" w:w="1304"/>
+            <w:tcW w:type="dxa" w:w="1871"/>
           </w:tcPr>
           <w:p>
             <w:pPr>
@@ -401,7 +403,7 @@
       <w:tr>
         <w:tc>
           <w:tcPr>
-            <w:tcW w:type="dxa" w:w="1304"/>
+            <w:tcW w:type="dxa" w:w="1871"/>
             <w:gridSpan w:val="6"/>
           </w:tcPr>
           <w:p>
@@ -511,8 +513,8 @@
       </w:r>
     </w:p>
     <w:sectPr>
-      <w:pgSz w:w="10318" w:h="14570"/>
-      <w:pgMar w:top="1020" w:right="964" w:bottom="1020" w:left="964" w:header="720" w:footer="720" w:gutter="0"/>
+      <w:pgSz w:w="14570" w:h="10318" w:orient="landscape"/>
+      <w:pgMar w:top="850" w:right="1020" w:bottom="850" w:left="1020" w:header="720" w:footer="720" w:gutter="0"/>
       <w:cols w:space="720"/>
       <w:docGrid w:linePitch="360"/>
     </w:sectPr>

</xml_diff>